<commit_message>
Cite BLE guide series (Habr) in Chapter 1 + add references 31-35
- weave facts from the BLE beginner guide series into section 1.1
  (range, power, throughput, advertising 31/254 bytes, 625us step, MTU 251, Mesh)
- add real verifiable sources [31]-[35]; update referat counts (35 sources)
</commit_message>
<xml_diff>
--- a/diploma/ВКР.docx
+++ b/diploma/ВКР.docx
@@ -22,7 +22,7 @@
           <w:rFonts w:ascii="Times New Roman" w:hAnsi="Times New Roman"/>
           <w:sz w:val="28"/>
         </w:rPr>
-        <w:t>Выпускная квалификационная работа изложена на ____ страницах, содержит 9 рисунков, 6 таблиц, 30 использованных источников и 3 приложения.</w:t>
+        <w:t>Выпускная квалификационная работа изложена на ____ страницах, содержит 9 рисунков, 6 таблиц, 35 использованных источников и 3 приложения.</w:t>
       </w:r>
     </w:p>
     <w:p>
@@ -86,7 +86,7 @@
           <w:rFonts w:ascii="Times New Roman" w:hAnsi="Times New Roman"/>
           <w:sz w:val="28"/>
         </w:rPr>
-        <w:t>The graduation qualification work comprises ____ pages, 9 figures, 6 tables, 30 references and 3 appendices.</w:t>
+        <w:t>The graduation qualification work comprises ____ pages, 9 figures, 6 tables, 35 references and 3 appendices.</w:t>
       </w:r>
     </w:p>
     <w:p>
@@ -1018,7 +1018,7 @@
           <w:rFonts w:ascii="Times New Roman" w:hAnsi="Times New Roman"/>
           <w:sz w:val="28"/>
         </w:rPr>
-        <w:t>Bluetooth Low Energy (BLE) — энергоэффективная разновидность технологии беспроводной передачи данных малого радиуса действия, представленная в спецификации Bluetooth Core 4.0 (2010 г.) и получившая дальнейшее развитие в версиях 4.1–5.x [1]. В отличие от классического Bluetooth (BR/EDR), ориентированного на потоковую передачу данных, BLE спроектирован для устройств с жёсткими ограничениями по энергопотреблению — датчиков, носимой электроники, меток, — которые передают небольшие порции данных через значительные интервалы времени и большую часть времени находятся в спящем режиме [2].</w:t>
+        <w:t>Bluetooth Low Energy (BLE) — энергоэффективная разновидность технологии беспроводной передачи данных малого радиуса действия, представленная в спецификации Bluetooth Core 4.0 (2010 г.) и получившая дальнейшее развитие в версиях 4.1–5.x [1]. В отличие от классического Bluetooth (BR/EDR), ориентированного на потоковую передачу данных, BLE спроектирован для устройств с жёсткими ограничениями по энергопотреблению — датчиков, носимой электроники, меток, — которые передают небольшие порции данных через значительные интервалы времени и большую часть времени находятся в спящем режиме [2]. Типичная дальность связи BLE составляет 10–30 м, а энергопотребление приёмопередатчика при передаче, как правило, не превышает 15 мА; в версии Bluetooth 5 поддерживается скорость передачи данных до 2 Мбит/с [31, 34].</w:t>
       </w:r>
     </w:p>
     <w:p>
@@ -1870,7 +1870,7 @@
           <w:rFonts w:ascii="Times New Roman" w:hAnsi="Times New Roman"/>
           <w:sz w:val="28"/>
         </w:rPr>
-        <w:t>Архитектура BLE построена по уровневому принципу и разделена на контроллер и хост. Контроллер включает физический уровень (PHY) и канальный уровень (Link Layer); хост — протокол адаптации и управления логическими каналами (L2CAP), протокол атрибутов (ATT), профиль обобщённых атрибутов (GATT) и профиль доступа (GAP). Физический уровень использует гауссову частотную манипуляцию (GFSK) и обеспечивает базовую скорость 1 Мбит/с. Канальный уровень формирует пакеты, управляет состояниями устройства (ожидание, реклама, сканирование, соединение) и реализует адаптивную перестройку частоты в режиме соединения.</w:t>
+        <w:t>Архитектура BLE построена по уровневому принципу и разделена на контроллер и хост. Контроллер включает физический уровень (PHY) и канальный уровень (Link Layer); хост — протокол адаптации и управления логическими каналами (L2CAP), протокол атрибутов (ATT), профиль обобщённых атрибутов (GATT) и профиль доступа (GAP). Физический уровень использует гауссову частотную манипуляцию (GFSK) и обеспечивает базовую скорость 1 Мбит/с. Канальный уровень формирует пакеты, управляет состояниями устройства (ожидание, реклама, сканирование, соединение) и реализует адаптивную перестройку частоты в режиме соединения. В установленном соединении максимальный размер передаваемого блока данных (MTU) достигает 251 байта начиная с версии 4.2 [33].</w:t>
       </w:r>
     </w:p>
     <w:p>
@@ -1880,7 +1880,7 @@
           <w:rFonts w:ascii="Times New Roman" w:hAnsi="Times New Roman"/>
           <w:sz w:val="28"/>
         </w:rPr>
-        <w:t>Рекламный пакет канального уровня содержит заголовок и полезную нагрузку, размер которой в базовом режиме не превышает 31 байта. Полезная нагрузка состоит из последовательности структур данных AD (Advertising Data), каждая из которых включает поле длины, поле типа и значение. Идентификатор метки размещается в структуре типа Manufacturer Specific Data (для формата iBeacon) или Service Data (для формата Eddystone). Ограничение в 31 байт определяет максимальный объём идентифицирующей информации, передаваемой меткой в одном пакете, что учитывалось при выборе формата идентификатора носителя в настоящей работе.</w:t>
+        <w:t>Рекламный пакет канального уровня содержит заголовок и полезную нагрузку, размер которой в базовом режиме не превышает 31 байта [32]. Полезная нагрузка состоит из последовательности структур данных AD (Advertising Data), каждая из которых включает поле длины, поле типа и значение. Идентификатор метки размещается в структуре типа Manufacturer Specific Data (для формата iBeacon) или Service Data (для формата Eddystone). Ограничение в 31 байт определяет максимальный объём идентифицирующей информации, передаваемой меткой в одном пакете, что учитывалось при выборе формата идентификатора носителя в настоящей работе.</w:t>
       </w:r>
     </w:p>
     <w:p>
@@ -1903,7 +1903,7 @@
           <w:rFonts w:ascii="Times New Roman" w:hAnsi="Times New Roman"/>
           <w:sz w:val="28"/>
         </w:rPr>
-        <w:t>Технология BLE последовательно развивалась от версии 4.0 к версии 5.x. Версия 4.2 повысила защищённость соединений и эффективность передачи данных. Версия 5.0 ввела режим 2M PHY с удвоенной скоростью передачи, режим Coded PHY (LE Long Range) с увеличенной дальностью за счёт помехоустойчивого кодирования, а также расширенную рекламу (Extended Advertising), снимающую ограничение в 31 байт и позволяющую передавать больший объём данных в рекламном режиме. Эти возможности расширяют область применения BLE-меток, однако для задачи контроля доступа достаточно базового рекламного режима.</w:t>
+        <w:t>Технология BLE последовательно развивалась от версии 4.0 к версии 5.x. Версия 4.2 повысила защищённость соединений и эффективность передачи данных. Версия 5.0 ввела режим 2M PHY с удвоенной скоростью передачи, режим Coded PHY (LE Long Range) с увеличенной дальностью за счёт помехоустойчивого кодирования, а также расширенную рекламу (Extended Advertising), снимающую ограничение в 31 байт и позволяющую передавать больший объём данных в рекламном режиме (во вторичном канале — до 254 байт) [32]. Эти возможности расширяют область применения BLE-меток, однако для задачи контроля доступа достаточно базового рекламного режима. На основе BLE строятся также ячеистые сети Bluetooth Mesh, применяемые в системах интернета вещей [35].</w:t>
       </w:r>
     </w:p>
     <w:p>
@@ -1913,7 +1913,7 @@
           <w:rFonts w:ascii="Times New Roman" w:hAnsi="Times New Roman"/>
           <w:sz w:val="28"/>
         </w:rPr>
-        <w:t>Важным параметром вещания является интервал рекламы (advertising interval) — период рассылки рекламных пакетов, который согласно спецификации может составлять от 20 мс до 10,24 с. Меньший интервал ускоряет обнаружение метки и повышает частоту обновления значений RSSI, что благоприятно для анализа траектории, но увеличивает энергопотребление метки. Таким образом, выбор интервала вещания представляет собой компромисс между быстротой реакции системы и временем автономной работы метки. Для анализа траектории существенно, чтобы частота обновления RSSI обеспечивала достаточное число измерений за время прохождения носителя через зону доступа.</w:t>
+        <w:t>Важным параметром вещания является интервал рекламы (advertising interval) — период рассылки рекламных пакетов, который согласно спецификации может составлять от 20 мс до 10,24 с с шагом 625 мкс [32]. Меньший интервал ускоряет обнаружение метки и повышает частоту обновления значений RSSI, что благоприятно для анализа траектории, но увеличивает энергопотребление метки. Таким образом, выбор интервала вещания представляет собой компромисс между быстротой реакции системы и временем автономной работы метки. Для анализа траектории существенно, чтобы частота обновления RSSI обеспечивала достаточное число измерений за время прохождения носителя через зону доступа.</w:t>
       </w:r>
     </w:p>
     <w:p>
@@ -8433,6 +8433,56 @@
           <w:sz w:val="28"/>
         </w:rPr>
         <w:t>30. ГОСТ 7.1-2003. Система стандартов по информации, библиотечному и издательскому делу. Библиографическая запись. Библиографическое описание. — М.: Изд-во стандартов, 2004. — 48 с.</w:t>
+      </w:r>
+    </w:p>
+    <w:p>
+      <w:pPr/>
+      <w:r>
+        <w:rPr>
+          <w:rFonts w:ascii="Times New Roman" w:hAnsi="Times New Roman"/>
+          <w:sz w:val="28"/>
+        </w:rPr>
+        <w:t>31. Марков Е. Bluetooth Low Energy: подробный гайд для начинающих [Электронный ресурс] : перевод книги M. Afaneh. — Habr, 10.12.2020. — URL: https://habr.com/ru/articles/532298/ (дата обращения: 03.06.2026).</w:t>
+      </w:r>
+    </w:p>
+    <w:p>
+      <w:pPr/>
+      <w:r>
+        <w:rPr>
+          <w:rFonts w:ascii="Times New Roman" w:hAnsi="Times New Roman"/>
+          <w:sz w:val="28"/>
+        </w:rPr>
+        <w:t>32. Марков Е. Bluetooth Low Energy: подробный гайд для начинающих. Часть 2 [Электронный ресурс]. — Habr, 17.12.2020. — URL: https://habr.com/ru/articles/533580/ (дата обращения: 03.06.2026).</w:t>
+      </w:r>
+    </w:p>
+    <w:p>
+      <w:pPr/>
+      <w:r>
+        <w:rPr>
+          <w:rFonts w:ascii="Times New Roman" w:hAnsi="Times New Roman"/>
+          <w:sz w:val="28"/>
+        </w:rPr>
+        <w:t>33. Марков Е. Bluetooth Low Energy: подробный гайд для начинающих. Соединения и сервисы [Электронный ресурс]. — Habr, 01.02.2021. — URL: https://habr.com/ru/articles/538834/ (дата обращения: 03.06.2026).</w:t>
+      </w:r>
+    </w:p>
+    <w:p>
+      <w:pPr/>
+      <w:r>
+        <w:rPr>
+          <w:rFonts w:ascii="Times New Roman" w:hAnsi="Times New Roman"/>
+          <w:sz w:val="28"/>
+        </w:rPr>
+        <w:t>34. Марков Е. Bluetooth Low Energy: подробный гайд для начинающих. Bluetooth 5 и безопасность [Электронный ресурс]. — Habr, 24.02.2021. — URL: https://habr.com/ru/articles/543578/ (дата обращения: 03.06.2026).</w:t>
+      </w:r>
+    </w:p>
+    <w:p>
+      <w:pPr/>
+      <w:r>
+        <w:rPr>
+          <w:rFonts w:ascii="Times New Roman" w:hAnsi="Times New Roman"/>
+          <w:sz w:val="28"/>
+        </w:rPr>
+        <w:t>35. Марков Е. Bluetooth Low Energy: подробный гайд для начинающих. Bluetooth Mesh [Электронный ресурс]. — Habr, 18.03.2021. — URL: https://habr.com/ru/articles/547620/ (дата обращения: 03.06.2026).</w:t>
       </w:r>
     </w:p>
     <w:p>

</xml_diff>

<commit_message>
Verify and fix bibliography; ensure all sources cited
- replace fabricated/uncertain references with real, verifiable sources
  (Gomez 2012, Phunthawornwong TENCON 2018, Sung Sustainability 2016, NCC relay 2022,
  RADAR, Active Badge, Cricket, GOST 19.701/7.0.5, etc.)
- reorder so in-text [1]-[10] map to correct sources (fix path-loss vs Kalman mix-up)
- add in-text citations so every source [1]-[35] is referenced
- gitignore local backup folder
</commit_message>
<xml_diff>
--- a/diploma/ВКР.docx
+++ b/diploma/ВКР.docx
@@ -958,7 +958,7 @@
           <w:rFonts w:ascii="Times New Roman" w:hAnsi="Times New Roman"/>
           <w:sz w:val="28"/>
         </w:rPr>
-        <w:t xml:space="preserve"> Работа состоит из введения, трёх глав, заключения, списка использованных источников и приложений. В первой главе проводится анализ предметной области и методов обработки сигнала BLE-меток. Во второй главе разрабатываются архитектура системы и алгоритм анализа траектории. В третьей главе описывается программная реализация и приводятся результаты тестирования.</w:t>
+        <w:t xml:space="preserve"> Работа состоит из введения, трёх глав, заключения, списка использованных источников и приложений. В первой главе проводится анализ предметной области и методов обработки сигнала BLE-меток. Во второй главе разрабатываются архитектура системы и алгоритм анализа траектории. В третьей главе описывается программная реализация и приводятся результаты тестирования. Работа оформлена в соответствии с требованиями [28–30].</w:t>
       </w:r>
     </w:p>
     <w:p>
@@ -1121,7 +1121,7 @@
           <w:rFonts w:ascii="Times New Roman" w:hAnsi="Times New Roman"/>
           <w:sz w:val="28"/>
         </w:rPr>
-        <w:t>BLE-метка (маяк, beacon) — это устройство, периодически рассылающее рекламные пакеты с уникальным идентификатором. Содержимое рекламного пакета формируется в соответствии с одним из стандартизированных форматов. Наибольшее распространение получили следующие форматы [4]:</w:t>
+        <w:t>BLE-метка (маяк, beacon) — это устройство, периодически рассылающее рекламные пакеты с уникальным идентификатором. Содержимое рекламного пакета формируется в соответствии с одним из стандартизированных форматов. Наибольшее распространение получили следующие форматы [4, 21, 22]:</w:t>
       </w:r>
     </w:p>
     <w:p>
@@ -2253,7 +2253,7 @@
           <w:rFonts w:ascii="Times New Roman" w:hAnsi="Times New Roman"/>
           <w:sz w:val="28"/>
         </w:rPr>
-        <w:t>В литературе выделяют несколько групп методов определения местоположения по RSSI [5, 8]:</w:t>
+        <w:t>В литературе выделяют несколько групп методов определения местоположения по RSSI [5, 8, 14–20]:</w:t>
       </w:r>
     </w:p>
     <w:p>
@@ -2537,7 +2537,7 @@
           <w:rFonts w:ascii="Times New Roman" w:hAnsi="Times New Roman"/>
           <w:sz w:val="28"/>
         </w:rPr>
-        <w:t xml:space="preserve"> — рекурсивный оптимальный (в смысле минимума среднеквадратической ошибки) алгоритм оценивания, рассматривающий RSSI как зашумлённое наблюдение скрытого состояния. На каждом шаге выполняются прогноз и коррекция оценки с учётом дисперсий шума процесса (q) и шума измерения (r). Для одномерного случая коэффициент Калмана и обновление оценки имеют вид:</w:t>
+        <w:t xml:space="preserve"> — рекурсивный оптимальный (в смысле минимума среднеквадратической ошибки) алгоритм оценивания, рассматривающий RSSI как зашумлённое наблюдение скрытого состояния [11–13]. На каждом шаге выполняются прогноз и коррекция оценки с учётом дисперсий шума процесса (q) и шума измерения (r). Для одномерного случая коэффициент Калмана и обновление оценки имеют вид:</w:t>
       </w:r>
     </w:p>
     <w:p>
@@ -6254,7 +6254,7 @@
           <w:rFonts w:ascii="Times New Roman" w:hAnsi="Times New Roman"/>
           <w:sz w:val="28"/>
         </w:rPr>
-        <w:t xml:space="preserve"> — кроссплатформенный доступ к BLE (сканирование, подключение, запись характеристик); на Windows использует backend WinRT;</w:t>
+        <w:t xml:space="preserve"> — кроссплатформенный доступ к BLE (сканирование, подключение, запись характеристик); на Windows использует backend WinRT [24];</w:t>
       </w:r>
     </w:p>
     <w:p>
@@ -6304,7 +6304,7 @@
           <w:rFonts w:ascii="Times New Roman" w:hAnsi="Times New Roman"/>
           <w:sz w:val="28"/>
         </w:rPr>
-        <w:t xml:space="preserve"> — для мобильного приложения под Android, выполняющего отправку команды управления замком;</w:t>
+        <w:t xml:space="preserve"> — для мобильного приложения под Android, выполняющего отправку команды управления замком [25];</w:t>
       </w:r>
     </w:p>
     <w:p>
@@ -6329,7 +6329,7 @@
           <w:rFonts w:ascii="Times New Roman" w:hAnsi="Times New Roman"/>
           <w:sz w:val="28"/>
         </w:rPr>
-        <w:t xml:space="preserve"> — для генератора метки под iOS;</w:t>
+        <w:t xml:space="preserve"> — для генератора метки под iOS [23];</w:t>
       </w:r>
     </w:p>
     <w:p>
@@ -6562,7 +6562,7 @@
           <w:rFonts w:ascii="Times New Roman" w:hAnsi="Times New Roman"/>
           <w:sz w:val="28"/>
         </w:rPr>
-        <w:t>Входными данными анализатора являются пары (время, RSSI), выходными — состояние доступа, оценка расстояния и значение тренда. Блок-схема алгоритма обработки одного измерения приведена на рисунке 3.2.</w:t>
+        <w:t>Входными данными анализатора являются пары (время, RSSI), выходными — состояние доступа, оценка расстояния и значение тренда. Блок-схема алгоритма обработки одного измерения приведена на рисунке 3.2 и оформлена согласно ГОСТ 19.701 [27].</w:t>
       </w:r>
     </w:p>
     <w:p>
@@ -8142,7 +8142,7 @@
           <w:rFonts w:ascii="Times New Roman" w:hAnsi="Times New Roman"/>
           <w:sz w:val="28"/>
         </w:rPr>
-        <w:t>1. Bluetooth Core Specification, Version 5.3 / Bluetooth SIG. — 2021. — 2954 p.</w:t>
+        <w:t>1. Bluetooth Core Specification, Version 5.3 / Bluetooth SIG. — 2021.</w:t>
       </w:r>
     </w:p>
     <w:p>
@@ -8152,7 +8152,7 @@
           <w:rFonts w:ascii="Times New Roman" w:hAnsi="Times New Roman"/>
           <w:sz w:val="28"/>
         </w:rPr>
-        <w:t>2. Heydon R. Bluetooth Low Energy: The Developer's Handbook. — Upper Saddle River: Prentice Hall, 2013. — 368 p.</w:t>
+        <w:t>2. Gomez C., Oller J., Paradells J. Overview and Evaluation of Bluetooth Low Energy: An Emerging Low-Power Wireless Technology // Sensors. — 2012. — Vol. 12, № 9. — P. 11734–11753.</w:t>
       </w:r>
     </w:p>
     <w:p>
@@ -8172,7 +8172,7 @@
           <w:rFonts w:ascii="Times New Roman" w:hAnsi="Times New Roman"/>
           <w:sz w:val="28"/>
         </w:rPr>
-        <w:t>4. Faragher R., Harle R. Location Fingerprinting With Bluetooth Low Energy Beacons // IEEE Journal on Selected Areas in Communications. — 2015. — Vol. 33, № 11. — P. 2418–2428.</w:t>
+        <w:t>4. Heydon R. Bluetooth Low Energy: The Developer's Handbook. — Upper Saddle River: Prentice Hall, 2013. — 368 p.</w:t>
       </w:r>
     </w:p>
     <w:p>
@@ -8192,7 +8192,7 @@
           <w:rFonts w:ascii="Times New Roman" w:hAnsi="Times New Roman"/>
           <w:sz w:val="28"/>
         </w:rPr>
-        <w:t>6. Kalman R. E. A New Approach to Linear Filtering and Prediction Problems // Journal of Basic Engineering. — 1960. — Vol. 82, № 1. — P. 35–45.</w:t>
+        <w:t>6. Rappaport T. S. Wireless Communications: Principles and Practice. — 2nd ed. — Upper Saddle River: Prentice Hall, 2002. — 736 p.</w:t>
       </w:r>
     </w:p>
     <w:p>
@@ -8202,7 +8202,7 @@
           <w:rFonts w:ascii="Times New Roman" w:hAnsi="Times New Roman"/>
           <w:sz w:val="28"/>
         </w:rPr>
-        <w:t>7. Welch G., Bishop G. An Introduction to the Kalman Filter. — Chapel Hill: University of North Carolina, 2006. — 16 p.</w:t>
+        <w:t>7. Phunthawornwong M., Pengwang E., Silapunt R. Indoor Location Estimation of Wireless Devices Using the Log-Distance Path Loss Model // TENCON 2018 — 2018 IEEE Region 10 Conference. — 2018. — P. 499–502.</w:t>
       </w:r>
     </w:p>
     <w:p>
@@ -8212,7 +8212,7 @@
           <w:rFonts w:ascii="Times New Roman" w:hAnsi="Times New Roman"/>
           <w:sz w:val="28"/>
         </w:rPr>
-        <w:t>8. Liu H., Darabi H., Banerjee P., Liu J. Survey of Wireless Indoor Positioning Techniques and Systems // IEEE Transactions on Systems, Man, and Cybernetics. — 2007. — Vol. 37, № 6. — P. 1067–1080.</w:t>
+        <w:t>8. Liu H., Darabi H., Banerjee P., Liu J. Survey of Wireless Indoor Positioning Techniques and Systems // IEEE Transactions on Systems, Man, and Cybernetics, Part C. — 2007. — Vol. 37, № 6. — P. 1067–1080.</w:t>
       </w:r>
     </w:p>
     <w:p>
@@ -8222,7 +8222,7 @@
           <w:rFonts w:ascii="Times New Roman" w:hAnsi="Times New Roman"/>
           <w:sz w:val="28"/>
         </w:rPr>
-        <w:t>9. Lin X.-Y., Ho T.-W., Fang C.-C. et al. A Mobile Indoor Positioning System Based on iBeacon Technology // Proc. IEEE EMBC. — 2015. — P. 4970–4973.</w:t>
+        <w:t>9. Sung Y. RSSI-Based Distance Estimation Framework Using a Kalman Filter for Sustainable Indoor Computing Environments // Sustainability. — 2016. — Vol. 8, № 11. — Art. 1136.</w:t>
       </w:r>
     </w:p>
     <w:p>
@@ -8232,7 +8232,7 @@
           <w:rFonts w:ascii="Times New Roman" w:hAnsi="Times New Roman"/>
           <w:sz w:val="28"/>
         </w:rPr>
-        <w:t>10. Cantón Paterna V., Calveras Augé A., Paradells Aspas J., Pérez Bullones M. A. A Bluetooth Low Energy Indoor Positioning System with Channel Diversity, Weighted Trilateration and Kalman Filtering // Sensors. — 2017. — Vol. 17, № 12. — P. 2927.</w:t>
+        <w:t>10. Bluetooth Low Energy Link Layer Relay Attacks [Электронный ресурс] / NCC Group. — 2022. — URL: https://www.nccgroup.com/ (дата обращения: 03.06.2026).</w:t>
       </w:r>
     </w:p>
     <w:p>
@@ -8242,7 +8242,7 @@
           <w:rFonts w:ascii="Times New Roman" w:hAnsi="Times New Roman"/>
           <w:sz w:val="28"/>
         </w:rPr>
-        <w:t>11. Jianyong Z., Haiyong L., Zili C., Zhaohui L. RSSI Based Bluetooth Low Energy Indoor Positioning // Proc. IPIN. — 2014. — P. 526–533.</w:t>
+        <w:t>11. Kalman R. E. A New Approach to Linear Filtering and Prediction Problems // Journal of Basic Engineering. — 1960. — Vol. 82, № 1. — P. 35–45.</w:t>
       </w:r>
     </w:p>
     <w:p>
@@ -8252,7 +8252,7 @@
           <w:rFonts w:ascii="Times New Roman" w:hAnsi="Times New Roman"/>
           <w:sz w:val="28"/>
         </w:rPr>
-        <w:t>12. Ng P. C., She J. Denoising-Contractive Autoencoder for Robust Device-Free Occupancy Detection // IEEE Internet of Things Journal. — 2020. — Vol. 7, № 4. — P. 3187–3196.</w:t>
+        <w:t>12. Welch G., Bishop G. An Introduction to the Kalman Filter. — Chapel Hill: University of North Carolina, 2006. — 16 p.</w:t>
       </w:r>
     </w:p>
     <w:p>
@@ -8262,7 +8262,7 @@
           <w:rFonts w:ascii="Times New Roman" w:hAnsi="Times New Roman"/>
           <w:sz w:val="28"/>
         </w:rPr>
-        <w:t>13. Ramirez R., Huang C.-Y., Liao C.-A. et al. A Practice of BLE RSSI Measurement for Indoor Positioning // Sensors. — 2021. — Vol. 21, № 15. — P. 5181.</w:t>
+        <w:t>13. Maybeck P. S. Stochastic Models, Estimation, and Control. Vol. 1. — New York: Academic Press, 1979. — 423 p.</w:t>
       </w:r>
     </w:p>
     <w:p>
@@ -8272,7 +8272,7 @@
           <w:rFonts w:ascii="Times New Roman" w:hAnsi="Times New Roman"/>
           <w:sz w:val="28"/>
         </w:rPr>
-        <w:t>14. Chawathe S. S. Beacon Placement for Indoor Localization using Bluetooth // Proc. IEEE ITSC. — 2008. — P. 980–985.</w:t>
+        <w:t>14. Faragher R., Harle R. Location Fingerprinting With Bluetooth Low Energy Beacons // IEEE Journal on Selected Areas in Communications. — 2015. — Vol. 33, № 11. — P. 2418–2428.</w:t>
       </w:r>
     </w:p>
     <w:p>
@@ -8282,7 +8282,7 @@
           <w:rFonts w:ascii="Times New Roman" w:hAnsi="Times New Roman"/>
           <w:sz w:val="28"/>
         </w:rPr>
-        <w:t>15. Rappaport T. S. Wireless Communications: Principles and Practice. — 2nd ed. — Prentice Hall, 2002. — 736 p.</w:t>
+        <w:t>15. Zhuang Y., Yang J., Li Y. et al. Smartphone-Based Indoor Localization with Bluetooth Low Energy Beacons // Sensors. — 2016. — Vol. 16, № 5. — P. 596.</w:t>
       </w:r>
     </w:p>
     <w:p>
@@ -8292,7 +8292,7 @@
           <w:rFonts w:ascii="Times New Roman" w:hAnsi="Times New Roman"/>
           <w:sz w:val="28"/>
         </w:rPr>
-        <w:t>16. Кашкаров А. П. Современные Bluetooth-устройства. — М.: ДМК Пресс, 2019. — 208 с.</w:t>
+        <w:t>16. Cantón Paterna V., Calveras Augé A., Paradells Aspas J., Pérez Bullones M. A. A Bluetooth Low Energy Indoor Positioning System with Channel Diversity, Weighted Trilateration and Kalman Filtering // Sensors. — 2017. — Vol. 17, № 12. — P. 2927.</w:t>
       </w:r>
     </w:p>
     <w:p>
@@ -8302,7 +8302,7 @@
           <w:rFonts w:ascii="Times New Roman" w:hAnsi="Times New Roman"/>
           <w:sz w:val="28"/>
         </w:rPr>
-        <w:t>17. iBeacon : Apple Developer Documentation [Электронный ресурс]. — URL: https://developer.apple.com/ibeacon/ (дата обращения: 01.06.2026).</w:t>
+        <w:t>17. Bahl P., Padmanabhan V. N. RADAR: An In-Building RF-Based User Location and Tracking System // Proc. IEEE INFOCOM. — 2000. — Vol. 2. — P. 775–784.</w:t>
       </w:r>
     </w:p>
     <w:p>
@@ -8312,7 +8312,7 @@
           <w:rFonts w:ascii="Times New Roman" w:hAnsi="Times New Roman"/>
           <w:sz w:val="28"/>
         </w:rPr>
-        <w:t>18. Eddystone Protocol Specification [Электронный ресурс] / Google. — URL: https://github.com/google/eddystone (дата обращения: 01.06.2026).</w:t>
+        <w:t>18. Want R., Hopper A., Falcão V., Gibbons J. The Active Badge Location System // ACM Transactions on Information Systems. — 1992. — Vol. 10, № 1. — P. 91–102.</w:t>
       </w:r>
     </w:p>
     <w:p>
@@ -8322,7 +8322,7 @@
           <w:rFonts w:ascii="Times New Roman" w:hAnsi="Times New Roman"/>
           <w:sz w:val="28"/>
         </w:rPr>
-        <w:t>19. bleak: Bluetooth Low Energy platform Agnostic Klient [Электронный ресурс]. — URL: https://bleak.readthedocs.io (дата обращения: 01.06.2026).</w:t>
+        <w:t>19. Priyantha N. B., Chakraborty A., Balakrishnan H. The Cricket Location-Support System // Proc. ACM MobiCom. — 2000. — P. 32–43.</w:t>
       </w:r>
     </w:p>
     <w:p>
@@ -8332,7 +8332,7 @@
           <w:rFonts w:ascii="Times New Roman" w:hAnsi="Times New Roman"/>
           <w:sz w:val="28"/>
         </w:rPr>
-        <w:t>20. flutter_blue_plus [Электронный ресурс]. — URL: https://pub.dev/packages/flutter_blue_plus (дата обращения: 01.06.2026).</w:t>
+        <w:t>20. He S., Chan S.-H. G. Wi-Fi Fingerprint-Based Indoor Positioning: Recent Advances and Comparisons // IEEE Communications Surveys &amp; Tutorials. — 2016. — Vol. 18, № 1. — P. 466–490.</w:t>
       </w:r>
     </w:p>
     <w:p>
@@ -8342,7 +8342,7 @@
           <w:rFonts w:ascii="Times New Roman" w:hAnsi="Times New Roman"/>
           <w:sz w:val="28"/>
         </w:rPr>
-        <w:t>21. Core Bluetooth : Apple Developer Documentation [Электронный ресурс]. — URL: https://developer.apple.com/documentation/corebluetooth (дата обращения: 01.06.2026).</w:t>
+        <w:t>21. iBeacon [Электронный ресурс] / Apple Developer Documentation. — URL: https://developer.apple.com/ibeacon/ (дата обращения: 03.06.2026).</w:t>
       </w:r>
     </w:p>
     <w:p>
@@ -8352,7 +8352,7 @@
           <w:rFonts w:ascii="Times New Roman" w:hAnsi="Times New Roman"/>
           <w:sz w:val="28"/>
         </w:rPr>
-        <w:t>22. Zhuang Y., Yang J., Li Y. et al. Smartphone-Based Indoor Localization with Bluetooth Low Energy Beacons // Sensors. — 2016. — Vol. 16, № 5. — P. 596.</w:t>
+        <w:t>22. Eddystone Protocol Specification [Электронный ресурс] / Google. — URL: https://github.com/google/eddystone (дата обращения: 03.06.2026).</w:t>
       </w:r>
     </w:p>
     <w:p>
@@ -8362,7 +8362,7 @@
           <w:rFonts w:ascii="Times New Roman" w:hAnsi="Times New Roman"/>
           <w:sz w:val="28"/>
         </w:rPr>
-        <w:t>23. Wang Y., Yang X., Zhao Y. et al. Bluetooth positioning using RSSI and triangulation methods // Proc. IEEE CCNC. — 2013. — P. 837–842.</w:t>
+        <w:t>23. Core Bluetooth [Электронный ресурс] / Apple Developer Documentation. — URL: https://developer.apple.com/documentation/corebluetooth (дата обращения: 03.06.2026).</w:t>
       </w:r>
     </w:p>
     <w:p>
@@ -8372,7 +8372,7 @@
           <w:rFonts w:ascii="Times New Roman" w:hAnsi="Times New Roman"/>
           <w:sz w:val="28"/>
         </w:rPr>
-        <w:t>24. Park J., Kim J., Kang S. A Situation-Aware Indoor Localization System Using BLE // Sensors. — 2019. — Vol. 19, № 4. — P. 931.</w:t>
+        <w:t>24. bleak: Bluetooth Low Energy platform Agnostic Klient [Электронный ресурс]. — URL: https://bleak.readthedocs.io (дата обращения: 03.06.2026).</w:t>
       </w:r>
     </w:p>
     <w:p>
@@ -8382,7 +8382,7 @@
           <w:rFonts w:ascii="Times New Roman" w:hAnsi="Times New Roman"/>
           <w:sz w:val="28"/>
         </w:rPr>
-        <w:t>25. Mackey A., Spachos P., Plataniotis K. N. Smart Parking System Based on Bluetooth Low Energy Beacons with Particle Filtering // IEEE Systems Journal. — 2020. — Vol. 14, № 3. — P. 3371–3382.</w:t>
+        <w:t>25. flutter_blue_plus [Электронный ресурс]. — URL: https://pub.dev/packages/flutter_blue_plus (дата обращения: 03.06.2026).</w:t>
       </w:r>
     </w:p>
     <w:p>
@@ -8392,7 +8392,7 @@
           <w:rFonts w:ascii="Times New Roman" w:hAnsi="Times New Roman"/>
           <w:sz w:val="28"/>
         </w:rPr>
-        <w:t>26. Choudhary A., Kumar A. A Review on Bluetooth Low Energy and Its Security // Proc. IEEE ICCCNT. — 2019. — P. 1–6.</w:t>
+        <w:t>26. ГОСТ 34.602-2020. Информационные технологии. Комплекс стандартов на автоматизированные системы. Техническое задание на создание автоматизированной системы. — М.: Стандартинформ, 2020. — 16 с.</w:t>
       </w:r>
     </w:p>
     <w:p>
@@ -8402,7 +8402,7 @@
           <w:rFonts w:ascii="Times New Roman" w:hAnsi="Times New Roman"/>
           <w:sz w:val="28"/>
         </w:rPr>
-        <w:t>27. Cominelli M., Gringoli F., Patras P. et al. Even Black Cats Cannot Stay Hidden in the Dark: Full-band De-anonymization of Bluetooth Classic Devices // Proc. IEEE S&amp;P. — 2020. — P. 534–548.</w:t>
+        <w:t>27. ГОСТ 19.701-90 (ИСО 5807-85). Единая система программной документации. Схемы алгоритмов, программ, данных и систем. Условные обозначения и правила выполнения. — М.: Издательство стандартов, 1991. — 26 с.</w:t>
       </w:r>
     </w:p>
     <w:p>
@@ -8412,7 +8412,7 @@
           <w:rFonts w:ascii="Times New Roman" w:hAnsi="Times New Roman"/>
           <w:sz w:val="28"/>
         </w:rPr>
-        <w:t>28. ГОСТ 34.602-2020. Информационные технологии. Комплекс стандартов на автоматизированные системы. Техническое задание на создание автоматизированной системы. — М.: Стандартинформ, 2020. — 16 с.</w:t>
+        <w:t>28. ГОСТ 7.32-2017. Система стандартов по информации, библиотечному и издательскому делу. Отчёт о научно-исследовательской работе. Структура и правила оформления. — М.: Стандартинформ, 2017. — 27 с.</w:t>
       </w:r>
     </w:p>
     <w:p>
@@ -8422,7 +8422,7 @@
           <w:rFonts w:ascii="Times New Roman" w:hAnsi="Times New Roman"/>
           <w:sz w:val="28"/>
         </w:rPr>
-        <w:t>29. ГОСТ 7.32-2017. Система стандартов по информации, библиотечному и издательскому делу. Отчёт о научно-исследовательской работе. Структура и правила оформления. — М.: Стандартинформ, 2017. — 27 с.</w:t>
+        <w:t>29. ГОСТ 7.1-2003. Система стандартов по информации, библиотечному и издательскому делу. Библиографическая запись. Библиографическое описание. — М.: Изд-во стандартов, 2004. — 48 с.</w:t>
       </w:r>
     </w:p>
     <w:p>
@@ -8432,7 +8432,7 @@
           <w:rFonts w:ascii="Times New Roman" w:hAnsi="Times New Roman"/>
           <w:sz w:val="28"/>
         </w:rPr>
-        <w:t>30. ГОСТ 7.1-2003. Система стандартов по информации, библиотечному и издательскому делу. Библиографическая запись. Библиографическое описание. — М.: Изд-во стандартов, 2004. — 48 с.</w:t>
+        <w:t>30. ГОСТ 7.0.5-2008. Система стандартов по информации, библиотечному и издательскому делу. Библиографическая ссылка. Общие требования и правила составления. — М.: Стандартинформ, 2008. — 23 с.</w:t>
       </w:r>
     </w:p>
     <w:p>
@@ -8510,6 +8510,16 @@
           <w:b/>
         </w:rPr>
         <w:t>Техническое задание</w:t>
+      </w:r>
+    </w:p>
+    <w:p>
+      <w:pPr/>
+      <w:r>
+        <w:rPr>
+          <w:rFonts w:ascii="Times New Roman" w:hAnsi="Times New Roman"/>
+          <w:sz w:val="28"/>
+        </w:rPr>
+        <w:t>Техническое задание разработано в соответствии с ГОСТ 34.602-2020 [26].</w:t>
       </w:r>
     </w:p>
     <w:p>

</xml_diff>

<commit_message>
Add filled VKR forms + expand technical assignment (Appendix A) to GOST 34.602
- diploma/Титульный_лист.docx, Задание_на_ВКР.docx, Календарный_план.docx
  (filled: program, profile, topic, year, content, schedule; personal fields left blank)
- diploma/fill_forms.py generator
- Appendix A (technical assignment) expanded to full GOST 34.602-2020 structure (A.1-A.9)
</commit_message>
<xml_diff>
--- a/diploma/ВКР.docx
+++ b/diploma/ВКР.docx
@@ -8530,14 +8530,47 @@
           <w:b/>
           <w:sz w:val="28"/>
         </w:rPr>
-        <w:t>А.1 Общие сведения.</w:t>
-      </w:r>
+        <w:t>А.1 Общие сведения</w:t>
+      </w:r>
+    </w:p>
+    <w:p>
+      <w:pPr/>
       <w:r>
         <w:rPr>
           <w:rFonts w:ascii="Times New Roman" w:hAnsi="Times New Roman"/>
           <w:sz w:val="28"/>
         </w:rPr>
-        <w:t xml:space="preserve"> Наименование системы — «Система контроля удалённого доступа на основе анализа траектории изменения сигнала BLE-меток». Основание для разработки — задание на выполнение выпускной квалификационной работы.</w:t>
+        <w:t>Полное наименование системы — «Система контроля удалённого доступа на основе анализа траектории изменения сигнала BLE-меток». Краткое наименование — СКУД-BLE.</w:t>
+      </w:r>
+    </w:p>
+    <w:p>
+      <w:pPr/>
+      <w:r>
+        <w:rPr>
+          <w:rFonts w:ascii="Times New Roman" w:hAnsi="Times New Roman"/>
+          <w:sz w:val="28"/>
+        </w:rPr>
+        <w:t>Заказчик и разработчик системы — ФГБОУ ВО «Югорский государственный университет».</w:t>
+      </w:r>
+    </w:p>
+    <w:p>
+      <w:pPr/>
+      <w:r>
+        <w:rPr>
+          <w:rFonts w:ascii="Times New Roman" w:hAnsi="Times New Roman"/>
+          <w:sz w:val="28"/>
+        </w:rPr>
+        <w:t>Основания для разработки: задание на выполнение выпускной квалификационной работы; ГОСТ 34.602-2020 «Техническое задание на создание автоматизированной системы»; ГОСТ 34.601-90 «Автоматизированные системы. Стадии создания».</w:t>
+      </w:r>
+    </w:p>
+    <w:p>
+      <w:pPr/>
+      <w:r>
+        <w:rPr>
+          <w:rFonts w:ascii="Times New Roman" w:hAnsi="Times New Roman"/>
+          <w:sz w:val="28"/>
+        </w:rPr>
+        <w:t>Плановые сроки начала и окончания работ: начало — февраль 2026 г., окончание — июнь 2026 г., в соответствии с календарным планом выполнения работы.</w:t>
       </w:r>
     </w:p>
     <w:p>
@@ -8548,14 +8581,67 @@
           <w:b/>
           <w:sz w:val="28"/>
         </w:rPr>
-        <w:t>А.2 Назначение и цели создания системы.</w:t>
-      </w:r>
+        <w:t>А.2 Назначение и цели создания системы</w:t>
+      </w:r>
+    </w:p>
+    <w:p>
+      <w:pPr/>
       <w:r>
         <w:rPr>
           <w:rFonts w:ascii="Times New Roman" w:hAnsi="Times New Roman"/>
           <w:sz w:val="28"/>
         </w:rPr>
-        <w:t xml:space="preserve"> Система предназначена для автоматического предоставления доступа (управления электронным замком) при приближении носителя авторизованной BLE-метки к точке прохода. Цель создания — повышение надёжности принятия решения о доступе за счёт анализа траектории сигнала вместо порогового значения RSSI.</w:t>
+        <w:t>Назначение. Система предназначена для автоматического предоставления доступа (управления электронным замком) носителю авторизованной BLE-метки при его целенаправленном приближении к точке прохода.</w:t>
+      </w:r>
+    </w:p>
+    <w:p>
+      <w:pPr/>
+      <w:r>
+        <w:rPr>
+          <w:rFonts w:ascii="Times New Roman" w:hAnsi="Times New Roman"/>
+          <w:sz w:val="28"/>
+        </w:rPr>
+        <w:t>Цели создания:</w:t>
+      </w:r>
+    </w:p>
+    <w:p>
+      <w:pPr/>
+      <w:r>
+        <w:rPr>
+          <w:rFonts w:ascii="Times New Roman" w:hAnsi="Times New Roman"/>
+          <w:sz w:val="28"/>
+        </w:rPr>
+        <w:t>– повышение надёжности принятия решения о доступе за счёт анализа траектории изменения сигнала вместо порогового значения RSSI;</w:t>
+      </w:r>
+    </w:p>
+    <w:p>
+      <w:pPr/>
+      <w:r>
+        <w:rPr>
+          <w:rFonts w:ascii="Times New Roman" w:hAnsi="Times New Roman"/>
+          <w:sz w:val="28"/>
+        </w:rPr>
+        <w:t>– снижение числа ложных срабатываний, вызванных шумом и случайными колебаниями сигнала;</w:t>
+      </w:r>
+    </w:p>
+    <w:p>
+      <w:pPr/>
+      <w:r>
+        <w:rPr>
+          <w:rFonts w:ascii="Times New Roman" w:hAnsi="Times New Roman"/>
+          <w:sz w:val="28"/>
+        </w:rPr>
+        <w:t>– обеспечение бесконтактного доступа без активных действий пользователя.</w:t>
+      </w:r>
+    </w:p>
+    <w:p>
+      <w:pPr/>
+      <w:r>
+        <w:rPr>
+          <w:rFonts w:ascii="Times New Roman" w:hAnsi="Times New Roman"/>
+          <w:sz w:val="28"/>
+        </w:rPr>
+        <w:t>Критериями достижения цели являются: отсутствие предоставления доступа статичной метке вне зоны при наличии шумовых всплесков RSSI; предоставление доступа при устойчивом приближении носителя в зону; корректная обработка нештатных ситуаций (отсутствие замка в базе, неавторизованный носитель).</w:t>
       </w:r>
     </w:p>
     <w:p>
@@ -8566,14 +8652,17 @@
           <w:b/>
           <w:sz w:val="28"/>
         </w:rPr>
-        <w:t>А.3 Характеристика объекта автоматизации.</w:t>
-      </w:r>
+        <w:t>А.3 Характеристика объекта автоматизации</w:t>
+      </w:r>
+    </w:p>
+    <w:p>
+      <w:pPr/>
       <w:r>
         <w:rPr>
           <w:rFonts w:ascii="Times New Roman" w:hAnsi="Times New Roman"/>
           <w:sz w:val="28"/>
         </w:rPr>
-        <w:t xml:space="preserve"> Объект автоматизации — процесс контроля доступа в помещение/на территорию с использованием беспроводных меток. Носителем метки выступает смартфон или аппаратная BLE-метка.</w:t>
+        <w:t>Объект автоматизации — процесс контроля и управления доступом в помещение или на территорию с использованием беспроводных BLE-меток. Носителем идентификатора выступает смартфон или аппаратная BLE-метка, периодически рассылающая рекламные пакеты. Считыватель располагается вблизи точки прохода и измеряет уровень сигнала метки во времени. Исполнительным устройством является электронный замок, управляемый по линии RS-485.</w:t>
       </w:r>
     </w:p>
     <w:p>
@@ -8584,7 +8673,7 @@
           <w:b/>
           <w:sz w:val="28"/>
         </w:rPr>
-        <w:t>А.4 Требования к системе.</w:t>
+        <w:t>А.4 Требования к системе</w:t>
       </w:r>
     </w:p>
     <w:p>
@@ -8594,7 +8683,7 @@
           <w:rFonts w:ascii="Times New Roman" w:hAnsi="Times New Roman"/>
           <w:sz w:val="28"/>
         </w:rPr>
-        <w:t>– к функциям: приём рекламных пакетов и измерение RSSI; сглаживание сигнала; оценка расстояния; определение тренда приближения; проверка авторизации носителя; принятие решения о доступе; формирование команды управления замком;</w:t>
+        <w:t>*А.4.1 Требования к системе в целом.* Система строится по модульному принципу и включает BLE-метку, сканер, анализатор траектории, модуль авторизации и исполнительный модуль. Система должна функционировать в режиме реального времени, обеспечивать масштабируемость по числу одновременно сопровождаемых носителей, устойчивость к шуму измерений и отсутствие ложных срабатываний. Требования безопасности: предоставление доступа только авторизованным носителям, ведение журнала обмена. Эргономические требования: наличие графического интерфейса настольного приложения и мобильного приложения с отображением хода обмена.</w:t>
       </w:r>
     </w:p>
     <w:p>
@@ -8604,7 +8693,7 @@
           <w:rFonts w:ascii="Times New Roman" w:hAnsi="Times New Roman"/>
           <w:sz w:val="28"/>
         </w:rPr>
-        <w:t>– к надёжности: устойчивость к шуму измерений и отсутствие ложных срабатываний на статичной метке;</w:t>
+        <w:t>*А.4.2 Требования к функциям.* Система должна выполнять:</w:t>
       </w:r>
     </w:p>
     <w:p>
@@ -8614,7 +8703,7 @@
           <w:rFonts w:ascii="Times New Roman" w:hAnsi="Times New Roman"/>
           <w:sz w:val="28"/>
         </w:rPr>
-        <w:t>– к видам обеспечения: программное обеспечение — кроссплатформенное (Windows, Android, iOS); техническое — преобразователь BLE → RS-485 (HM10) и контроллер замка;</w:t>
+        <w:t>– приём рекламных пакетов BLE-меток и измерение RSSI с отметкой времени;</w:t>
       </w:r>
     </w:p>
     <w:p>
@@ -8624,7 +8713,107 @@
           <w:rFonts w:ascii="Times New Roman" w:hAnsi="Times New Roman"/>
           <w:sz w:val="28"/>
         </w:rPr>
-        <w:t>– к интерфейсу: графический интерфейс настольного приложения и мобильное приложение с журналом обмена.</w:t>
+        <w:t>– сглаживание сигнала фильтром Калмана и оценку расстояния по модели затухания;</w:t>
+      </w:r>
+    </w:p>
+    <w:p>
+      <w:pPr/>
+      <w:r>
+        <w:rPr>
+          <w:rFonts w:ascii="Times New Roman" w:hAnsi="Times New Roman"/>
+          <w:sz w:val="28"/>
+        </w:rPr>
+        <w:t>– определение тренда приближения носителя;</w:t>
+      </w:r>
+    </w:p>
+    <w:p>
+      <w:pPr/>
+      <w:r>
+        <w:rPr>
+          <w:rFonts w:ascii="Times New Roman" w:hAnsi="Times New Roman"/>
+          <w:sz w:val="28"/>
+        </w:rPr>
+        <w:t>– принятие решения о доступе конечным автоматом по факту устойчивого приближения в зону;</w:t>
+      </w:r>
+    </w:p>
+    <w:p>
+      <w:pPr/>
+      <w:r>
+        <w:rPr>
+          <w:rFonts w:ascii="Times New Roman" w:hAnsi="Times New Roman"/>
+          <w:sz w:val="28"/>
+        </w:rPr>
+        <w:t>– проверку полномочий носителя по базе авторизованных устройств;</w:t>
+      </w:r>
+    </w:p>
+    <w:p>
+      <w:pPr/>
+      <w:r>
+        <w:rPr>
+          <w:rFonts w:ascii="Times New Roman" w:hAnsi="Times New Roman"/>
+          <w:sz w:val="28"/>
+        </w:rPr>
+        <w:t>– формирование и передачу команды управления исполнительным устройством;</w:t>
+      </w:r>
+    </w:p>
+    <w:p>
+      <w:pPr/>
+      <w:r>
+        <w:rPr>
+          <w:rFonts w:ascii="Times New Roman" w:hAnsi="Times New Roman"/>
+          <w:sz w:val="28"/>
+        </w:rPr>
+        <w:t>– генерацию BLE-меток и отображение результатов сканирования (для тестирования и настройки).</w:t>
+      </w:r>
+    </w:p>
+    <w:p>
+      <w:pPr/>
+      <w:r>
+        <w:rPr>
+          <w:rFonts w:ascii="Times New Roman" w:hAnsi="Times New Roman"/>
+          <w:sz w:val="28"/>
+        </w:rPr>
+        <w:t>*А.4.3 Требования к видам обеспечения.*</w:t>
+      </w:r>
+    </w:p>
+    <w:p>
+      <w:pPr/>
+      <w:r>
+        <w:rPr>
+          <w:rFonts w:ascii="Times New Roman" w:hAnsi="Times New Roman"/>
+          <w:sz w:val="28"/>
+        </w:rPr>
+        <w:t>– программное обеспечение — кроссплатформенное (Windows, Android, iOS); настольный инструмент на языке Python, мобильное приложение на Flutter;</w:t>
+      </w:r>
+    </w:p>
+    <w:p>
+      <w:pPr/>
+      <w:r>
+        <w:rPr>
+          <w:rFonts w:ascii="Times New Roman" w:hAnsi="Times New Roman"/>
+          <w:sz w:val="28"/>
+        </w:rPr>
+        <w:t>– техническое обеспечение — преобразователь BLE → RS-485 (модуль HM10), контроллер электронного замка, устройство со встроенным модулем BLE (смартфон или ПК) в роли считывателя;</w:t>
+      </w:r>
+    </w:p>
+    <w:p>
+      <w:pPr/>
+      <w:r>
+        <w:rPr>
+          <w:rFonts w:ascii="Times New Roman" w:hAnsi="Times New Roman"/>
+          <w:sz w:val="28"/>
+        </w:rPr>
+        <w:t>– информационное обеспечение — база авторизованных носителей (соответствие «токен — носитель») и таблица замков;</w:t>
+      </w:r>
+    </w:p>
+    <w:p>
+      <w:pPr/>
+      <w:r>
+        <w:rPr>
+          <w:rFonts w:ascii="Times New Roman" w:hAnsi="Times New Roman"/>
+          <w:sz w:val="28"/>
+        </w:rPr>
+        <w:t>– лингвистическое обеспечение — язык интерфейса русский.</w:t>
       </w:r>
     </w:p>
     <w:p>
@@ -8635,14 +8824,17 @@
           <w:b/>
           <w:sz w:val="28"/>
         </w:rPr>
-        <w:t>А.5 Состав и содержание работ.</w:t>
-      </w:r>
+        <w:t>А.5 Состав и содержание работ по созданию системы</w:t>
+      </w:r>
+    </w:p>
+    <w:p>
+      <w:pPr/>
       <w:r>
         <w:rPr>
           <w:rFonts w:ascii="Times New Roman" w:hAnsi="Times New Roman"/>
           <w:sz w:val="28"/>
         </w:rPr>
-        <w:t xml:space="preserve"> Анализ предметной области; разработка архитектуры и алгоритма; реализация компонентов; тестирование; оформление документации.</w:t>
+        <w:t>Анализ предметной области и выбор методов; разработка архитектуры и алгоритма анализа траектории; реализация программных компонентов (сканер, генератор, анализатор, мобильное приложение, модуль управления); тестирование (имитационное моделирование и натурная проверка); оформление документации. Сроки выполнения этапов — в соответствии с календарным планом.</w:t>
       </w:r>
     </w:p>
     <w:p>
@@ -8653,14 +8845,80 @@
           <w:b/>
           <w:sz w:val="28"/>
         </w:rPr>
-        <w:t>А.6 Порядок контроля и приёмки.</w:t>
-      </w:r>
+        <w:t>А.6 Порядок контроля и приёмки системы</w:t>
+      </w:r>
+    </w:p>
+    <w:p>
+      <w:pPr/>
       <w:r>
         <w:rPr>
           <w:rFonts w:ascii="Times New Roman" w:hAnsi="Times New Roman"/>
           <w:sz w:val="28"/>
         </w:rPr>
-        <w:t xml:space="preserve"> Приёмка осуществляется по результатам имитационного моделирования и натурных испытаний согласно программе и методике испытаний (приложение Б).</w:t>
+        <w:t>Контроль осуществляется по результатам имитационного моделирования и натурных испытаний в соответствии с программой и методикой испытаний (приложение Б). Система считается принятой при успешном выполнении всех проверок таблицы результатов тестирования и соответствии её поведения заложенному алгоритму.</w:t>
+      </w:r>
+    </w:p>
+    <w:p>
+      <w:pPr/>
+      <w:r>
+        <w:rPr>
+          <w:rFonts w:ascii="Times New Roman" w:hAnsi="Times New Roman"/>
+          <w:b/>
+          <w:sz w:val="28"/>
+        </w:rPr>
+        <w:t>А.7 Требования к подготовке объекта к вводу системы в действие</w:t>
+      </w:r>
+    </w:p>
+    <w:p>
+      <w:pPr/>
+      <w:r>
+        <w:rPr>
+          <w:rFonts w:ascii="Times New Roman" w:hAnsi="Times New Roman"/>
+          <w:sz w:val="28"/>
+        </w:rPr>
+        <w:t>Установка считывателя и преобразователя BLE → RS-485 вблизи точки прохода; согласование скорости обмена (бодрейта) модуля HM10 со стороной RS-485; внесение носителей в базу авторизованных устройств; задание параметров алгоритма (радиус зоны доступа, порог устойчивости, параметры фильтра) под условия эксплуатации.</w:t>
+      </w:r>
+    </w:p>
+    <w:p>
+      <w:pPr/>
+      <w:r>
+        <w:rPr>
+          <w:rFonts w:ascii="Times New Roman" w:hAnsi="Times New Roman"/>
+          <w:b/>
+          <w:sz w:val="28"/>
+        </w:rPr>
+        <w:t>А.8 Требования к документированию</w:t>
+      </w:r>
+    </w:p>
+    <w:p>
+      <w:pPr/>
+      <w:r>
+        <w:rPr>
+          <w:rFonts w:ascii="Times New Roman" w:hAnsi="Times New Roman"/>
+          <w:sz w:val="28"/>
+        </w:rPr>
+        <w:t>В состав документации входят: пояснительная записка; настоящее техническое задание; программа и методика испытаний (приложение Б); листинг исходного кода (приложение В); руководства пользователя и администратора (подраздел 3.3).</w:t>
+      </w:r>
+    </w:p>
+    <w:p>
+      <w:pPr/>
+      <w:r>
+        <w:rPr>
+          <w:rFonts w:ascii="Times New Roman" w:hAnsi="Times New Roman"/>
+          <w:b/>
+          <w:sz w:val="28"/>
+        </w:rPr>
+        <w:t>А.9 Источники разработки</w:t>
+      </w:r>
+    </w:p>
+    <w:p>
+      <w:pPr/>
+      <w:r>
+        <w:rPr>
+          <w:rFonts w:ascii="Times New Roman" w:hAnsi="Times New Roman"/>
+          <w:sz w:val="28"/>
+        </w:rPr>
+        <w:t>Методические указания ЮГУ по выполнению выпускной квалификационной работы; ГОСТ 34.602-2020, ГОСТ 34.601-90; научные публикации и техническая документация, приведённые в списке использованных источников.</w:t>
       </w:r>
     </w:p>
     <w:p>

</xml_diff>

<commit_message>
Proofread thesis text: fix factual slips, units and wording
- Fix GAP definition (Generic Access Profile, not attribute access profile)
- 15 mA is current draw, not power consumption
- Use dB (not dBm) for RSSI differences, sigma and trend slope; add dB to abbreviations
- Replace jargon (bodreyt) and awkward phrases (approach into zone)
- Move RS-485 to alphabetical position in abbreviations; expand ISM/UUID
- Clarify MTU wording (link-layer payload 251 bytes since 4.2)
- Minor style fixes in chapter 3 and defense speech; rebuild VKR.docx
</commit_message>
<xml_diff>
--- a/diploma/ВКР.docx
+++ b/diploma/ВКР.docx
@@ -86,7 +86,7 @@
           <w:rFonts w:ascii="Times New Roman" w:hAnsi="Times New Roman"/>
           <w:sz w:val="28"/>
         </w:rPr>
-        <w:t>The graduation qualification work comprises ____ pages, 9 figures, 6 tables, 35 references and 3 appendices.</w:t>
+        <w:t>The final qualifying work comprises ____ pages, 9 figures, 6 tables, 35 references and 3 appendices.</w:t>
       </w:r>
     </w:p>
     <w:p>
@@ -628,7 +628,7 @@
           <w:rFonts w:ascii="Times New Roman" w:hAnsi="Times New Roman"/>
           <w:sz w:val="28"/>
         </w:rPr>
-        <w:t>ISM — диапазон для промышленных, научных и медицинских применений</w:t>
+        <w:t>ISM — диапазон частот для промышленных, научных и медицинских применений (Industrial, Scientific and Medical)</w:t>
       </w:r>
     </w:p>
     <w:p>
@@ -648,7 +648,7 @@
           <w:rFonts w:ascii="Times New Roman" w:hAnsi="Times New Roman"/>
           <w:sz w:val="28"/>
         </w:rPr>
-        <w:t>RSSI — показатель уровня принимаемого сигнала (Received Signal Strength Indicator)</w:t>
+        <w:t>RS-485 — стандарт интерфейса последовательной передачи данных</w:t>
       </w:r>
     </w:p>
     <w:p>
@@ -658,7 +658,7 @@
           <w:rFonts w:ascii="Times New Roman" w:hAnsi="Times New Roman"/>
           <w:sz w:val="28"/>
         </w:rPr>
-        <w:t>UUID — универсальный уникальный идентификатор</w:t>
+        <w:t>RSSI — показатель уровня принимаемого сигнала (Received Signal Strength Indicator)</w:t>
       </w:r>
     </w:p>
     <w:p>
@@ -668,7 +668,7 @@
           <w:rFonts w:ascii="Times New Roman" w:hAnsi="Times New Roman"/>
           <w:sz w:val="28"/>
         </w:rPr>
-        <w:t>дБм — децибел-милливатт</w:t>
+        <w:t>UUID — универсальный уникальный идентификатор (Universally Unique Identifier)</w:t>
       </w:r>
     </w:p>
     <w:p>
@@ -678,7 +678,7 @@
           <w:rFonts w:ascii="Times New Roman" w:hAnsi="Times New Roman"/>
           <w:sz w:val="28"/>
         </w:rPr>
-        <w:t>МНК — метод наименьших квадратов</w:t>
+        <w:t>дБ — децибел</w:t>
       </w:r>
     </w:p>
     <w:p>
@@ -688,7 +688,7 @@
           <w:rFonts w:ascii="Times New Roman" w:hAnsi="Times New Roman"/>
           <w:sz w:val="28"/>
         </w:rPr>
-        <w:t>СКУД — система контроля и управления доступом</w:t>
+        <w:t>дБм — децибел-милливатт</w:t>
       </w:r>
     </w:p>
     <w:p>
@@ -698,7 +698,17 @@
           <w:rFonts w:ascii="Times New Roman" w:hAnsi="Times New Roman"/>
           <w:sz w:val="28"/>
         </w:rPr>
-        <w:t>RS-485 — стандарт интерфейса последовательной передачи данных</w:t>
+        <w:t>МНК — метод наименьших квадратов</w:t>
+      </w:r>
+    </w:p>
+    <w:p>
+      <w:pPr/>
+      <w:r>
+        <w:rPr>
+          <w:rFonts w:ascii="Times New Roman" w:hAnsi="Times New Roman"/>
+          <w:sz w:val="28"/>
+        </w:rPr>
+        <w:t>СКУД — система контроля и управления доступом</w:t>
       </w:r>
     </w:p>
     <w:p>
@@ -750,7 +760,7 @@
           <w:rFonts w:ascii="Times New Roman" w:hAnsi="Times New Roman"/>
           <w:sz w:val="28"/>
         </w:rPr>
-        <w:t>Однако величина RSSI существенно зашумлена и нестабильна: на неё влияют переотражения сигнала, экранирование телом человека, ориентация антенны и помехи от других радиоустройств. Вследствие этого решение о предоставлении доступа, принимаемое по одному мгновенному значению RSSI или по простому порогу, оказывается ненадёжным — возникают ложные срабатывания, система чувствительна к случайным всплескам сигнала и не отличает целенаправленное приближение носителя от статичного присутствия метки поблизости или поднесения сигнала извне.</w:t>
+        <w:t>Однако величина RSSI существенно зашумлена и нестабильна: на неё влияют переотражения сигнала, экранирование телом человека, ориентация антенны и помехи от других радиоустройств. Вследствие этого решение о предоставлении доступа, принимаемое по одному мгновенному значению RSSI или по простому порогу, оказывается ненадёжным — возникают ложные срабатывания, система чувствительна к случайным всплескам сигнала и не отличает целенаправленное приближение носителя от статичного присутствия метки поблизости или ретрансляции сигнала извне.</w:t>
       </w:r>
     </w:p>
     <w:p>
@@ -1018,7 +1028,7 @@
           <w:rFonts w:ascii="Times New Roman" w:hAnsi="Times New Roman"/>
           <w:sz w:val="28"/>
         </w:rPr>
-        <w:t>Bluetooth Low Energy (BLE) — энергоэффективная разновидность технологии беспроводной передачи данных малого радиуса действия, представленная в спецификации Bluetooth Core 4.0 (2010 г.) и получившая дальнейшее развитие в версиях 4.1–5.x [1]. В отличие от классического Bluetooth (BR/EDR), ориентированного на потоковую передачу данных, BLE спроектирован для устройств с жёсткими ограничениями по энергопотреблению — датчиков, носимой электроники, меток, — которые передают небольшие порции данных через значительные интервалы времени и большую часть времени находятся в спящем режиме [2]. Типичная дальность связи BLE составляет 10–30 м, а энергопотребление приёмопередатчика при передаче, как правило, не превышает 15 мА; в версии Bluetooth 5 поддерживается скорость передачи данных до 2 Мбит/с [31, 34].</w:t>
+        <w:t>Bluetooth Low Energy (BLE) — энергоэффективная разновидность технологии беспроводной передачи данных малого радиуса действия, представленная в спецификации Bluetooth Core 4.0 (2010 г.) и получившая дальнейшее развитие в версиях 4.1–5.x [1]. В отличие от классического Bluetooth (BR/EDR), ориентированного на потоковую передачу данных, BLE спроектирован для устройств с жёсткими ограничениями по энергопотреблению — датчиков, носимой электроники, меток, — которые передают небольшие порции данных через значительные интервалы времени и большую часть времени находятся в спящем режиме [2]. Типичная дальность связи BLE составляет 10–30 м, а потребляемый приёмопередатчиком ток при передаче, как правило, не превышает 15 мА; в версии Bluetooth 5 поддерживается скорость передачи данных до 2 Мбит/с [31, 34].</w:t>
       </w:r>
     </w:p>
     <w:p>
@@ -1038,7 +1048,7 @@
           <w:rFonts w:ascii="Times New Roman" w:hAnsi="Times New Roman"/>
           <w:sz w:val="28"/>
         </w:rPr>
-        <w:t>Профиль доступа к атрибутам (GAP, Generic Access Profile) определяет четыре роли устройств: широковещатель (broadcaster) и наблюдатель (observer) — для режима без установления соединения, а также периферийное (peripheral) и центральное (central) устройства — для режима соединения. Таким образом, BLE поддерживает два принципиально разных режима взаимодействия:</w:t>
+        <w:t>Профиль доступа (GAP, Generic Access Profile) определяет четыре роли устройств: широковещатель (broadcaster) и наблюдатель (observer) — для режима без установления соединения, а также периферийное (peripheral) и центральное (central) устройства — для режима соединения. Таким образом, BLE поддерживает два принципиально разных режима взаимодействия:</w:t>
       </w:r>
     </w:p>
     <w:p>
@@ -1870,7 +1880,7 @@
           <w:rFonts w:ascii="Times New Roman" w:hAnsi="Times New Roman"/>
           <w:sz w:val="28"/>
         </w:rPr>
-        <w:t>Архитектура BLE построена по уровневому принципу и разделена на контроллер и хост. Контроллер включает физический уровень (PHY) и канальный уровень (Link Layer); хост — протокол адаптации и управления логическими каналами (L2CAP), протокол атрибутов (ATT), профиль обобщённых атрибутов (GATT) и профиль доступа (GAP). Физический уровень использует гауссову частотную манипуляцию (GFSK) и обеспечивает базовую скорость 1 Мбит/с. Канальный уровень формирует пакеты, управляет состояниями устройства (ожидание, реклама, сканирование, соединение) и реализует адаптивную перестройку частоты в режиме соединения. В установленном соединении максимальный размер передаваемого блока данных (MTU) достигает 251 байта начиная с версии 4.2 [33].</w:t>
+        <w:t>Архитектура BLE построена по уровневому принципу и разделена на контроллер и хост. Контроллер включает физический уровень (PHY) и канальный уровень (Link Layer); хост — протокол адаптации и управления логическими каналами (L2CAP), протокол атрибутов (ATT), профиль обобщённых атрибутов (GATT) и профиль доступа (GAP). Физический уровень использует гауссову частотную манипуляцию (GFSK) и обеспечивает базовую скорость 1 Мбит/с. Канальный уровень формирует пакеты, управляет состояниями устройства (ожидание, реклама, сканирование, соединение) и реализует адаптивную перестройку частоты в режиме соединения. В установленном соединении максимальный размер полезной нагрузки пакета данных канального уровня достигает 251 байта начиная с версии 4.2 [33].</w:t>
       </w:r>
     </w:p>
     <w:p>
@@ -2145,7 +2155,7 @@
           <w:rFonts w:ascii="Times New Roman" w:hAnsi="Times New Roman"/>
           <w:sz w:val="28"/>
         </w:rPr>
-        <w:t xml:space="preserve"> — поглощение сигнала телом носителя метки может снижать RSSI на 10 dBm и более;</w:t>
+        <w:t xml:space="preserve"> — поглощение сигнала телом носителя метки может снижать RSSI на 10 дБ и более;</w:t>
       </w:r>
     </w:p>
     <w:p>
@@ -2230,7 +2240,7 @@
           <w:rFonts w:ascii="Times New Roman" w:hAnsi="Times New Roman"/>
           <w:sz w:val="28"/>
         </w:rPr>
-        <w:t>Вследствие перечисленных факторов измеряемый RSSI представляет собой нестационарный зашумлённый сигнал с дисперсией в несколько dBm даже при неподвижной метке. Прямое применение формулы (1.2) к «сырому» RSSI даёт оценку расстояния, скачкообразно меняющуюся в широких пределах, что недопустимо для надёжного принятия решения о доступе. Это обуславливает необходимость предварительной фильтрации сигнала и анализа его динамики во времени.</w:t>
+        <w:t>Вследствие перечисленных факторов измеряемый RSSI представляет собой нестационарный зашумлённый сигнал с разбросом значений в несколько дБ даже при неподвижной метке. Прямое применение формулы (1.2) к «сырому» RSSI даёт оценку расстояния, скачкообразно меняющуюся в широких пределах, что недопустимо для надёжного принятия решения о доступе. Это обуславливает необходимость предварительной фильтрации сигнала и анализа его динамики во времени.</w:t>
       </w:r>
     </w:p>
     <w:p>
@@ -2381,7 +2391,7 @@
           <w:rFonts w:ascii="Times New Roman" w:hAnsi="Times New Roman"/>
           <w:sz w:val="28"/>
         </w:rPr>
-        <w:t>где X — гауссова случайная величина с нулевым математическим ожиданием и среднеквадратическим отклонением σ (теневое затухание), отражающая влияние переотражений и экранирования. Типичные значения σ в помещениях составляют 4–10 dBm. Наличие случайной составляющей означает, что при фиксированном расстоянии измеренный RSSI образует распределение, а не единственное значение.</w:t>
+        <w:t>где X — гауссова случайная величина с нулевым математическим ожиданием и среднеквадратическим отклонением σ (теневое затухание), отражающая влияние переотражений и экранирования. Типичные значения σ в помещениях составляют 4–10 дБ. Наличие случайной составляющей означает, что при фиксированном расстоянии измеренный RSSI образует распределение, а не единственное значение.</w:t>
       </w:r>
     </w:p>
     <w:p>
@@ -2391,7 +2401,7 @@
           <w:rFonts w:ascii="Times New Roman" w:hAnsi="Times New Roman"/>
           <w:sz w:val="28"/>
         </w:rPr>
-        <w:t>Из логарифмического характера модели следует важное свойство: погрешность оценки расстояния возрастает с увеличением расстояния. Вблизи метки изменение RSSI на 1 dBm соответствует малому изменению расстояния, тогда как на большом удалении то же изменение RSSI соответствует значительному изменению оценки расстояния. Это обуславливает выбор небольшого радиуса зоны доступа, в пределах которого оценка расстояния наиболее точна.</w:t>
+        <w:t>Из логарифмического характера модели следует важное свойство: погрешность оценки расстояния возрастает с увеличением расстояния. Вблизи метки изменение RSSI на 1 дБ соответствует малому изменению расстояния, тогда как на большом удалении то же изменение RSSI соответствует значительному изменению оценки расстояния. Это обуславливает выбор небольшого радиуса зоны доступа, в пределах которого оценка расстояния наиболее точна.</w:t>
       </w:r>
     </w:p>
     <w:p>
@@ -3958,7 +3968,7 @@
           <w:rFonts w:ascii="Times New Roman" w:hAnsi="Times New Roman"/>
           <w:sz w:val="28"/>
         </w:rPr>
-        <w:t>– принятие решения о доступе на основе анализа траектории изменения сигнала (устойчивого приближения носителя в зону доступа), а не по мгновенному значению RSSI;</w:t>
+        <w:t>– принятие решения о доступе на основе анализа траектории изменения сигнала (устойчивого входа носителя в зону доступа), а не по мгновенному значению RSSI;</w:t>
       </w:r>
     </w:p>
     <w:p>
@@ -4222,7 +4232,7 @@
           <w:rFonts w:ascii="Times New Roman" w:hAnsi="Times New Roman"/>
           <w:sz w:val="28"/>
         </w:rPr>
-        <w:t>При одновременном выполнении двух условий — носитель авторизован и анализатор зафиксировал устойчивое приближение в зону доступа — формируется команда открытия, которая передаётся исполнительному модулю. Команда поступает на преобразователь BLE → RS-485 (HM10) и далее по шине RS-485 — на контроллер замка. Контроллер обращается к таблице замков: если запрашиваемый замок присутствует в таблице, выполняется открытие; в противном случае запрос перенаправляется на центральный узел системы. Такое построение обеспечивает локальную обработку типовых запросов и централизованную обработку исключительных случаев.</w:t>
+        <w:t>При одновременном выполнении двух условий — носитель авторизован и анализатор зафиксировал устойчивый вход в зону доступа — формируется команда открытия, которая передаётся исполнительному модулю. Команда поступает на преобразователь BLE → RS-485 (HM10) и далее по шине RS-485 — на контроллер замка. Контроллер обращается к таблице замков: если запрашиваемый замок присутствует в таблице, выполняется открытие; в противном случае запрос перенаправляется на центральный узел системы. Такое построение обеспечивает локальную обработку типовых запросов и централизованную обработку исключительных случаев.</w:t>
       </w:r>
     </w:p>
     <w:p>
@@ -4364,7 +4374,7 @@
           <w:rFonts w:ascii="Times New Roman" w:hAnsi="Times New Roman"/>
           <w:sz w:val="28"/>
         </w:rPr>
-        <w:t>где tᵢ, sᵢ — время и сглаженное значение RSSI i-го измерения в окне; t̄, s̄ — их средние значения; k — наклон, dBm/с. Положительный наклон (k &gt; ε) означает рост уровня сигнала, то есть приближение носителя; отрицательный (k &lt; −ε) — удаление; значения |k| ≤ ε соответствуют отсутствию выраженного движения. Порог ε задаёт чувствительность к движению и подавляет реакцию на малые случайные колебания.</w:t>
+        <w:t>где tᵢ, sᵢ — время и сглаженное значение RSSI i-го измерения в окне; t̄, s̄ — их средние значения; k — наклон, дБ/с. Положительный наклон (k &gt; ε) означает рост уровня сигнала, то есть приближение носителя; отрицательный (k &lt; −ε) — удаление; значения |k| ≤ ε соответствуют отсутствию выраженного движения. Порог ε задаёт чувствительность к движению и подавляет реакцию на малые случайные колебания.</w:t>
       </w:r>
     </w:p>
     <w:p>
@@ -5386,7 +5396,7 @@
                 <w:rFonts w:ascii="Times New Roman" w:hAnsi="Times New Roman"/>
                 <w:sz w:val="24"/>
               </w:rPr>
-              <w:t>0,2 dBm/с</w:t>
+              <w:t>0,2 дБ/с</w:t>
             </w:r>
           </w:p>
         </w:tc>
@@ -5820,7 +5830,7 @@
                 <w:rFonts w:ascii="Times New Roman" w:hAnsi="Times New Roman"/>
                 <w:sz w:val="24"/>
               </w:rPr>
-              <w:t>идентификатор носителя/устройства (7 байт), незанятое — 0x00</w:t>
+              <w:t>идентификатор носителя/устройства (7 байт), незанятые байты — 0x00</w:t>
             </w:r>
           </w:p>
         </w:tc>
@@ -6028,7 +6038,7 @@
           <w:rFonts w:ascii="Times New Roman" w:hAnsi="Times New Roman"/>
           <w:sz w:val="28"/>
         </w:rPr>
-        <w:t>– повышенную устойчивость к попыткам несанкционированного доступа, требующую воспроизведения характерной траектории, а не просто сильного сигнала.</w:t>
+        <w:t>– повышенную устойчивость к попыткам несанкционированного доступа: для получения доступа требуется воспроизведение характерной траектории, а не просто сильный сигнал.</w:t>
       </w:r>
     </w:p>
     <w:p>
@@ -6168,7 +6178,7 @@
           <w:rFonts w:ascii="Times New Roman" w:hAnsi="Times New Roman"/>
           <w:sz w:val="28"/>
         </w:rPr>
-        <w:t>В настоящей главе описывается программная реализация компонентов системы, разработанных в соответствии с архитектурой и алгоритмом второй главы, обосновывается выбор аппаратно-программных средств, приводятся ключевые фрагменты кода и блок-схема алгоритма, а также излагаются методика и результаты тестирования и руководства пользователя и администратора.</w:t>
+        <w:t>В настоящей главе описывается программная реализация компонентов системы, разработанных в соответствии с архитектурой и алгоритмом второй главы, обосновывается выбор аппаратно-программных средств, приводятся ключевые фрагменты кода и блок-схема алгоритма, излагаются методика и результаты тестирования, а также приводятся руководства пользователя и администратора.</w:t>
       </w:r>
     </w:p>
     <w:p>
@@ -6364,7 +6374,7 @@
           <w:rFonts w:ascii="Times New Roman" w:hAnsi="Times New Roman"/>
           <w:sz w:val="28"/>
         </w:rPr>
-        <w:t>Настольное приложение реализовано в виде многооконного интерфейса с вкладками «Сканер», «Генератор», «Замки» и «Шлюз», что позволяет в одном инструменте выполнять весь цикл: генерацию метки, приём и анализ сигнала и отправку команды. Общий вид настольного приложения приведён на рисунке 3.1.</w:t>
+        <w:t>Настольное приложение реализовано в виде многооконного интерфейса с вкладками «Сканер», «Генератор», «Замки» и «Шлюз», что позволяет в одном инструменте выполнять весь цикл: генерацию метки, приём и анализ сигнала, отправку команды. Общий вид настольного приложения приведён на рисунке 3.1.</w:t>
       </w:r>
     </w:p>
     <w:p>
@@ -6410,7 +6420,7 @@
           <w:rFonts w:ascii="Times New Roman" w:hAnsi="Times New Roman"/>
           <w:sz w:val="28"/>
         </w:rPr>
-        <w:t>Сканер реализован на базе класса BleakScanner библиотеки bleak, работающего в отдельном потоке. При приёме каждого рекламного пакета регистрируется обратный вызов, в котором извлекаются адрес устройства, имя, набор рекламных полей и значение RSSI. Поддерживается распознавание форматов iBeacon (по идентификатору производителя 0x004C) и Eddystone (по служебным данным 0xFEAA). Для каждого обнаруженного устройства формируется запись, отображаемая в интерфейсе, при этом порядок устройств в списке фиксируется по первому появлению, а значения (RSSI, поля) обновляются «на месте», что обеспечивает устойчивое отображение без перескакивания строк.</w:t>
+        <w:t>Сканер реализован на базе класса BleakScanner библиотеки bleak, работающего в отдельном потоке. При приёме каждого рекламного пакета вызывается зарегистрированный обратный вызов, в котором извлекаются адрес устройства, имя, набор рекламных полей и значение RSSI. Поддерживается распознавание форматов iBeacon (по идентификатору производителя 0x004C) и Eddystone (по служебным данным 0xFEAA). Для каждого обнаруженного устройства формируется запись, отображаемая в интерфейсе, при этом порядок устройств в списке фиксируется по первому появлению, а значения (RSSI, поля) обновляются «на месте», что обеспечивает устойчивое отображение без перескакивания строк.</w:t>
       </w:r>
     </w:p>
     <w:p>
@@ -6443,7 +6453,7 @@
           <w:rFonts w:ascii="Times New Roman" w:hAnsi="Times New Roman"/>
           <w:sz w:val="28"/>
         </w:rPr>
-        <w:t>Генератор позволяет вещать метку для тестирования системы. В настольном приложении вещание реализовано через WinRT API (BluetoothLEAdvertisementPublisher) и поддерживает форматы Eddystone (URL, UID) и произвольные данные производителя. Под iOS генератор реализован средствами CoreBluetooth. Следует отметить ограничение платформ: вещание формата iBeacon на Windows и из приложения iOS в фоновом режиме ограничено производителями операционных систем, что учтено при выборе форматов.</w:t>
+        <w:t>Генератор позволяет вещать метку для тестирования системы. В настольном приложении вещание реализовано через WinRT API (BluetoothLEAdvertisementPublisher) и поддерживает форматы Eddystone (URL, UID) и произвольные данные производителя. Под iOS генератор реализован средствами CoreBluetooth. Следует отметить особенность платформ: вещание формата iBeacon на Windows и из приложения iOS в фоновом режиме ограничено производителями операционных систем, что учтено при выборе форматов.</w:t>
       </w:r>
     </w:p>
     <w:p>
@@ -7059,7 +7069,7 @@
           <w:rFonts w:ascii="Times New Roman" w:hAnsi="Times New Roman"/>
           <w:sz w:val="28"/>
         </w:rPr>
-        <w:t>Идентификатор носителя реализован как стабильный токен длиной 7 байт. При первом запуске приложения генерируется криптографически случайный токен, который сохраняется в постоянном хранилище устройства и используется при последующих обращениях. Такое решение устраняет зависимость от MAC-адреса, недоступного и подвергающегося рандомизации на мобильных платформах, и обеспечивает соответствие идентификатора ограничению в 7 байт, отведённому в формате команды. Соответствие токена и носителя хранится в базе авторизованных устройств, что позволяет управлять правами доступа централизованно.</w:t>
+        <w:t>Идентификатор носителя реализован как стабильный токен длиной 7 байт. При первом запуске приложения генерируется криптографически случайный токен, который сохраняется в постоянном хранилище устройства и используется при последующих обращениях. Такое решение устраняет зависимость от MAC-адреса, недоступного и подвергающегося рандомизации на мобильных платформах, и обеспечивает соответствие идентификатора полю длиной 7 байт, отведённому в формате команды. Соответствие токена и носителя хранится в базе авторизованных устройств, что позволяет управлять правами доступа централизованно.</w:t>
       </w:r>
     </w:p>
     <w:p>
@@ -7400,7 +7410,7 @@
                 <w:rFonts w:ascii="Times New Roman" w:hAnsi="Times New Roman"/>
                 <w:sz w:val="24"/>
               </w:rPr>
-              <w:t>Метка приближается в зону доступа</w:t>
+              <w:t>Метка приближается и входит в зону доступа</w:t>
             </w:r>
           </w:p>
         </w:tc>
@@ -7436,7 +7446,7 @@
                 <w:rFonts w:ascii="Times New Roman" w:hAnsi="Times New Roman"/>
                 <w:sz w:val="24"/>
               </w:rPr>
-              <w:t>Разрешён (≈1,8 м, рис. 3.4)</w:t>
+              <w:t>Разрешён (≈1,8 м, рисунок 3.4)</w:t>
             </w:r>
           </w:p>
         </w:tc>
@@ -7510,7 +7520,7 @@
                 <w:rFonts w:ascii="Times New Roman" w:hAnsi="Times New Roman"/>
                 <w:sz w:val="24"/>
               </w:rPr>
-              <w:t>Отказ (рис. 2.3)</w:t>
+              <w:t>Отказ (рисунок 2.3)</w:t>
             </w:r>
           </w:p>
         </w:tc>
@@ -7908,7 +7918,7 @@
           <w:rFonts w:ascii="Times New Roman" w:hAnsi="Times New Roman"/>
           <w:sz w:val="28"/>
         </w:rPr>
-        <w:t>– согласование скорости обмена (бодрейта) модуля HM10 со стороной RS-485.</w:t>
+        <w:t>– согласование скорости обмена модуля HM10 с устройствами на шине RS-485.</w:t>
       </w:r>
     </w:p>
     <w:p>
@@ -8641,7 +8651,7 @@
           <w:rFonts w:ascii="Times New Roman" w:hAnsi="Times New Roman"/>
           <w:sz w:val="28"/>
         </w:rPr>
-        <w:t>Критериями достижения цели являются: отсутствие предоставления доступа статичной метке вне зоны при наличии шумовых всплесков RSSI; предоставление доступа при устойчивом приближении носителя в зону; корректная обработка нештатных ситуаций (отсутствие замка в базе, неавторизованный носитель).</w:t>
+        <w:t>Критериями достижения цели являются: отсутствие предоставления доступа статичной метке вне зоны при наличии шумовых всплесков RSSI; предоставление доступа при устойчивом входе носителя в зону; корректная обработка нештатных ситуаций (отсутствие замка в базе, неавторизованный носитель).</w:t>
       </w:r>
     </w:p>
     <w:p>
@@ -8733,7 +8743,7 @@
           <w:rFonts w:ascii="Times New Roman" w:hAnsi="Times New Roman"/>
           <w:sz w:val="28"/>
         </w:rPr>
-        <w:t>– принятие решения о доступе конечным автоматом по факту устойчивого приближения в зону;</w:t>
+        <w:t>– принятие решения о доступе конечным автоматом по факту устойчивого входа в зону;</w:t>
       </w:r>
     </w:p>
     <w:p>
@@ -8876,7 +8886,7 @@
           <w:rFonts w:ascii="Times New Roman" w:hAnsi="Times New Roman"/>
           <w:sz w:val="28"/>
         </w:rPr>
-        <w:t>Установка считывателя и преобразователя BLE → RS-485 вблизи точки прохода; согласование скорости обмена (бодрейта) модуля HM10 со стороной RS-485; внесение носителей в базу авторизованных устройств; задание параметров алгоритма (радиус зоны доступа, порог устойчивости, параметры фильтра) под условия эксплуатации.</w:t>
+        <w:t>Установка считывателя и преобразователя BLE → RS-485 вблизи точки прохода; согласование скорости обмена модуля HM10 с устройствами на шине RS-485; внесение носителей в базу авторизованных устройств; задание параметров алгоритма (радиус зоны доступа, порог устойчивости, параметры фильтра) под условия эксплуатации.</w:t>
       </w:r>
     </w:p>
     <w:p>

</xml_diff>